<commit_message>
Ajoute les démonstrations console et range les sources du TP
</commit_message>
<xml_diff>
--- a/TP_secu_1/docs/Walter_Arthur.docx
+++ b/TP_secu_1/docs/Walter_Arthur.docx
@@ -45,7 +45,7 @@
     </w:p>
     <w:p>
       <w:r>
-        <w:t>Les sources prioritaires sont TP_RSA_Enonce.pdf et RSA_B_A.py à la racine du dépôt. Exp_CRT_RSA.pdf précise la recombinaison CRT. Le programme conserve les facteurs premiers et les exposants publics du professeur.</w:t>
+        <w:t>Les sources prioritaires sont TP_RSA_Enonce.pdf et RSA_B_A.py dans TP_secu_1/sources. Exp_CRT_RSA.pdf, dans ce même dossier, précise la recombinaison CRT. Le programme conserve les facteurs premiers et les exposants publics du professeur.</w:t>
       </w:r>
     </w:p>
     <w:p>
@@ -740,7 +740,7 @@
     </w:p>
     <w:p>
       <w:r>
-        <w:t>Les conversions historiques du squelette ont été remplacées ensemble. Le bloc triple guillemets initial non refermé a été supprimé et les deux fonctions vides complétées. Les fichiers originaux à la racine restent inchangés.</w:t>
+        <w:t>Les conversions historiques du squelette ont été remplacées ensemble. Le bloc triple guillemets initial non refermé a été supprimé et les deux fonctions vides complétées. Les fichiers originaux sont conservés dans le dossier sources.</w:t>
       </w:r>
     </w:p>
     <w:p>
@@ -6823,7 +6823,7 @@
     </w:p>
     <w:p>
       <w:r>
-        <w:t>Sources du TP : TP_RSA_Enonce.pdf pages 2 à 4 ; Exp_CRT_RSA.pdf pages 1 et 2 ; RSA_B_A.py, Abdeljalil ABBAS-TURKI. Les copies originales sont conservées à la racine du dépôt.</w:t>
+        <w:t>Sources du TP : TP_RSA_Enonce.pdf pages 2 à 4 ; Exp_CRT_RSA.pdf pages 1 et 2 ; RSA_B_A.py, Abdeljalil ABBAS-TURKI. Les copies originales sont conservées dans TP_secu_1/sources.</w:t>
       </w:r>
     </w:p>
     <w:p>

</xml_diff>

<commit_message>
Simplifier la remise du TP RSA et clarifier les quatre modes de lancement
</commit_message>
<xml_diff>
--- a/TP_secu_1/docs/Walter_Arthur.docx
+++ b/TP_secu_1/docs/Walter_Arthur.docx
@@ -45,7 +45,7 @@
     </w:p>
     <w:p>
       <w:r>
-        <w:t>Les sources prioritaires sont TP_RSA_Enonce.pdf et RSA_B_A.py dans TP_secu_1/sources. Exp_CRT_RSA.pdf, dans ce même dossier, précise la recombinaison CRT. Le programme conserve les facteurs premiers et les exposants publics du professeur.</w:t>
+        <w:t>Les sources prioritaires sont TP_RSA_Enonce.pdf et RSA_B_A.py dans TP_secu_1/sources. Exp_CRT_RSA.pdf, dans ce même dossier, précise la recombinaison CRT. Le programme conserve les facteurs premiers et les exposants publics du TP.</w:t>
       </w:r>
     </w:p>
     <w:p>
@@ -58,7 +58,7 @@
     </w:p>
     <w:p>
       <w:r>
-        <w:t>Les trois parties fonctionnelles sont implémentées. Quinze tests automatisés contrôlent le calcul, les conversions, les traces, le CRT et le bourrage. Trois tests supplémentaires vérifient l'analyse de certificats X.509. La première CI a validé les calculs sous Python 3.10 et 3.13.</w:t>
+        <w:t>Les trois parties fonctionnelles sont implémentées. Seize tests automatisés contrôlent le calcul, les conversions, les traces, le CRT et le bourrage. Trois tests supplémentaires vérifient l'analyse de certificats X.509. Les calculs ont également été vérifiés sous Python 3.10 et 3.13 dans le dépôt.</w:t>
       </w:r>
     </w:p>
     <w:p>
@@ -143,7 +143,7 @@
           <w:rFonts w:ascii="DejaVu Sans Mono" w:hAnsi="DejaVu Sans Mono" w:eastAsia="DejaVu Sans Mono" w:cs="DejaVu Sans Mono"/>
           <w:sz w:val="17"/>
         </w:rPr>
-        <w:t>python Walter_Arthur_main.py --test</w:t>
+        <w:t>python Walter_Arthur_main.py --partie 1 --message "Bonjour Alice"</w:t>
       </w:r>
     </w:p>
     <w:p>
@@ -169,7 +169,7 @@
           <w:rFonts w:ascii="DejaVu Sans Mono" w:hAnsi="DejaVu Sans Mono" w:eastAsia="DejaVu Sans Mono" w:cs="DejaVu Sans Mono"/>
           <w:sz w:val="17"/>
         </w:rPr>
-        <w:t>python Walter_Arthur_main.py --partie 2 --message "Bonjour"</w:t>
+        <w:t>python Walter_Arthur_main.py --partie 2</w:t>
       </w:r>
     </w:p>
     <w:p>
@@ -197,7 +197,7 @@
     </w:p>
     <w:p>
       <w:r>
-        <w:t>L'option --sortie resultats/mon_execution.json enregistre les résultats en plus de les afficher. Les configurations F5 fournies dans .vscode permettent de lancer la démonstration, un message long ou les tests. Un point d'arrêt dans la marge permet de suivre les variables avec F10.</w:t>
+        <w:t>L'option --sortie resultats/mon_execution.json enregistre les résultats en plus de les afficher. Les configurations F5 fournies dans .vscode permettent de lancer chaque partie séparément ou les trois parties à la suite. Un point d'arrêt dans la marge permet de suivre les variables avec F10.</w:t>
       </w:r>
     </w:p>
     <w:p>
@@ -2349,7 +2349,7 @@
         <w:pStyle w:val="Heading2"/>
       </w:pPr>
       <w:r>
-        <w:t>Reproduire l'exemple du professeur</w:t>
+        <w:t>Reproduire l'exemple du TP</w:t>
       </w:r>
     </w:p>
     <w:tbl>
@@ -5751,7 +5751,7 @@
     </w:p>
     <w:p>
       <w:r>
-        <w:t>La commande python Walter_Arthur_main.py --test exécute quinze tests. Le journal local tests_locaux.txt conserve leur résultat. La première exécution GitHub Actions a passé les mêmes tests et les démonstrations sous Python 3.10 et 3.13.</w:t>
+        <w:t>Seize tests automatiques vérifient les fonctions RSA dans le dépôt. Le journal local tests_locaux.txt conserve leur résultat. Les calculs RSA et les démonstrations ont également été exécutés sous Python 3.10 et 3.13 dans la CI.</w:t>
       </w:r>
     </w:p>
     <w:tbl>
@@ -6162,7 +6162,7 @@
         <w:pStyle w:val="Heading1"/>
       </w:pPr>
       <w:r>
-        <w:t>Livrables limites et références</w:t>
+        <w:t>Livrables et limites</w:t>
       </w:r>
     </w:p>
     <w:p>
@@ -6787,7 +6787,7 @@
     </w:p>
     <w:p>
       <w:r>
-        <w:t>Les clés sont celles du professeur. Le code n'ajoute ni RSA-PSS, ni RSA-OAEP, ni gestion de confiance des clés de Bob. La signature en deux blocs conserve le SHA-256 avec ces petites clés, mais n'est pas un schéma standard : les deux blocs sont signés indépendamment. La construction est conservée pour les objectifs pédagogiques et ne doit pas être présentée comme sécurisée.</w:t>
+        <w:t>Les clés sont celles de l'énoncé. Le code n'ajoute ni RSA-PSS, ni RSA-OAEP, ni gestion de confiance des clés de Bob. La signature en deux blocs conserve le SHA-256 avec ces petites clés, mais n'est pas un schéma standard : les deux blocs sont signés indépendamment. La construction est conservée pour les objectifs pédagogiques et ne doit pas être présentée comme sécurisée.</w:t>
       </w:r>
     </w:p>
     <w:p>
@@ -6811,29 +6811,6 @@
     <w:p>
       <w:r>
         <w:t>Déposer Walter_Arthur_main.py, Walter_Arthur_util.py et docs/Walter_Arthur.pdf dans le devoir Teams. Les tests, les résultats JSON et la version Word sont disponibles dans le dépôt pour expliquer et reproduire le travail. Après dépôt, contrôler les pièces jointes et la confirmation de remise dans Teams.</w:t>
-      </w:r>
-    </w:p>
-    <w:p>
-      <w:pPr>
-        <w:pStyle w:val="Heading2"/>
-      </w:pPr>
-      <w:r>
-        <w:t>Références</w:t>
-      </w:r>
-    </w:p>
-    <w:p>
-      <w:r>
-        <w:t>Sources du TP : TP_RSA_Enonce.pdf pages 2 à 4 ; Exp_CRT_RSA.pdf pages 1 et 2 ; RSA_B_A.py, Abdeljalil ABBAS-TURKI. Les copies originales sont conservées dans TP_secu_1/sources.</w:t>
-      </w:r>
-    </w:p>
-    <w:p>
-      <w:r>
-        <w:t>Compléments techniques : RFC 8017, sections 7.2 et 8.2, https://www.rfc-editor.org/rfc/rfc8017.html ; RFC 8446, TLS 1.3, https://www.rfc-editor.org/rfc/rfc8446.html. Documentation VS Code : https://code.visualstudio.com/docs/python/run. Sources consultées le 16 octobre 2026.</w:t>
-      </w:r>
-    </w:p>
-    <w:p>
-      <w:r>
-        <w:t>Preuve du relevé : https://github.com/zeylon-labs/master2-TP/actions/runs/38928738912. Démonstrations et mesures locales : resultats/execution_complete.json et resultats/message_long.json.</w:t>
       </w:r>
     </w:p>
     <w:sectPr>

</xml_diff>